<commit_message>
docs: asigna Product Owner del equipo Scrum
Alonso David de León Rodarte toma PO además de developer, en
07-metodologia.md (fuente), 09-carta-patrocinadora.md y su versión docx.
Deja anotado que no autoaprueba su propio código, por Definition of Done.
</commit_message>
<xml_diff>
--- a/docs/carta-patrocinadora.docx
+++ b/docs/carta-patrocinadora.docx
@@ -714,7 +714,7 @@
           <w:b/>
           <w:bCs/>
         </w:rPr>
-        <w:t xml:space="preserve">Pendiente de asignar. Roles Scrum definidos, sin persona asignada todavía:</w:t>
+        <w:t xml:space="preserve">Product Owner asignado; Scrum Master pendiente.</w:t>
       </w:r>
     </w:p>
     <w:tbl>
@@ -820,6 +820,50 @@
                 <w:b w:val="false"/>
                 <w:bCs w:val="false"/>
               </w:rPr>
+              <w:t xml:space="preserve">Alonso David de León Rodarte</w:t>
+            </w:r>
+          </w:p>
+        </w:tc>
+      </w:tr>
+      <w:tr>
+        <w:tc>
+          <w:tcPr>
+            <w:tcW w:type="dxa" w:w="2800"/>
+          </w:tcPr>
+          <w:p>
+            <w:r>
+              <w:rPr>
+                <w:b w:val="false"/>
+                <w:bCs w:val="false"/>
+              </w:rPr>
+              <w:t xml:space="preserve">Scrum Master</w:t>
+            </w:r>
+          </w:p>
+        </w:tc>
+        <w:tc>
+          <w:tcPr>
+            <w:tcW w:type="dxa" w:w="5200"/>
+          </w:tcPr>
+          <w:p>
+            <w:r>
+              <w:rPr>
+                <w:b w:val="false"/>
+                <w:bCs w:val="false"/>
+              </w:rPr>
+              <w:t xml:space="preserve">Facilita ceremonias, quita bloqueos</w:t>
+            </w:r>
+          </w:p>
+        </w:tc>
+        <w:tc>
+          <w:tcPr>
+            <w:tcW w:type="dxa" w:w="1600"/>
+          </w:tcPr>
+          <w:p>
+            <w:r>
+              <w:rPr>
+                <w:b w:val="false"/>
+                <w:bCs w:val="false"/>
+              </w:rPr>
               <w:t xml:space="preserve">Por asignar</w:t>
             </w:r>
           </w:p>
@@ -836,7 +880,7 @@
                 <w:b w:val="false"/>
                 <w:bCs w:val="false"/>
               </w:rPr>
-              <w:t xml:space="preserve">Scrum Master</w:t>
+              <w:t xml:space="preserve">Equipo de desarrollo</w:t>
             </w:r>
           </w:p>
         </w:tc>
@@ -850,7 +894,7 @@
                 <w:b w:val="false"/>
                 <w:bCs w:val="false"/>
               </w:rPr>
-              <w:t xml:space="preserve">Facilita ceremonias, quita bloqueos</w:t>
+              <w:t xml:space="preserve">Implementa el sprint backlog</w:t>
             </w:r>
           </w:p>
         </w:tc>
@@ -864,51 +908,7 @@
                 <w:b w:val="false"/>
                 <w:bCs w:val="false"/>
               </w:rPr>
-              <w:t xml:space="preserve">Por asignar</w:t>
-            </w:r>
-          </w:p>
-        </w:tc>
-      </w:tr>
-      <w:tr>
-        <w:tc>
-          <w:tcPr>
-            <w:tcW w:type="dxa" w:w="2800"/>
-          </w:tcPr>
-          <w:p>
-            <w:r>
-              <w:rPr>
-                <w:b w:val="false"/>
-                <w:bCs w:val="false"/>
-              </w:rPr>
-              <w:t xml:space="preserve">Equipo de desarrollo</w:t>
-            </w:r>
-          </w:p>
-        </w:tc>
-        <w:tc>
-          <w:tcPr>
-            <w:tcW w:type="dxa" w:w="5200"/>
-          </w:tcPr>
-          <w:p>
-            <w:r>
-              <w:rPr>
-                <w:b w:val="false"/>
-                <w:bCs w:val="false"/>
-              </w:rPr>
-              <w:t xml:space="preserve">Implementa el sprint backlog</w:t>
-            </w:r>
-          </w:p>
-        </w:tc>
-        <w:tc>
-          <w:tcPr>
-            <w:tcW w:type="dxa" w:w="1600"/>
-          </w:tcPr>
-          <w:p>
-            <w:r>
-              <w:rPr>
-                <w:b w:val="false"/>
-                <w:bCs w:val="false"/>
-              </w:rPr>
-              <w:t xml:space="preserve">Los demás</w:t>
+              <w:t xml:space="preserve">Todos, incluido el PO</w:t>
             </w:r>
           </w:p>
         </w:tc>
@@ -923,7 +923,7 @@
           <w:i/>
           <w:iCs/>
         </w:rPr>
-        <w:t xml:space="preserve">En equipo de 6, PO y Scrum Master también pueden tomar tareas de desarrollo.</w:t>
+        <w:t xml:space="preserve">En equipo de 6, PO y Scrum Master también pueden tomar tareas de desarrollo. Alonso es PO y developer a la vez: no autoaprueba su propio código, otra persona del equipo revisa igual.</w:t>
       </w:r>
     </w:p>
     <w:p>

</xml_diff>

<commit_message>
docs: agrega sección Firma a la carta sponsor
Elemento que faltaba según la presentación de apoyo (PMI): firma de
Product Owner y Scrum Master, único sponsor posible al no haber cliente
externo en un proyecto escolar.
</commit_message>
<xml_diff>
--- a/docs/carta-patrocinadora.docx
+++ b/docs/carta-patrocinadora.docx
@@ -1159,6 +1159,220 @@
                 <w:bCs w:val="false"/>
               </w:rPr>
               <w:t xml:space="preserve">2018532</w:t>
+            </w:r>
+          </w:p>
+        </w:tc>
+      </w:tr>
+    </w:tbl>
+    <w:p>
+      <w:pPr>
+        <w:pStyle w:val="Heading1"/>
+        <w:spacing w:after="150" w:before="300"/>
+      </w:pPr>
+      <w:r>
+        <w:t xml:space="preserve">Firma</w:t>
+      </w:r>
+    </w:p>
+    <w:p>
+      <w:pPr>
+        <w:spacing w:after="120"/>
+      </w:pPr>
+      <w:r>
+        <w:t xml:space="preserve">Firman los dos roles de liderazgo Scrum. No hay sponsor externo en este proyecto (escolar, sin empresa/cliente), por lo que la firma representa el compromiso del equipo con lo establecido en esta carta.</w:t>
+      </w:r>
+    </w:p>
+    <w:tbl>
+      <w:tblPr>
+        <w:tblW w:type="dxa" w:w="9600"/>
+        <w:tblBorders>
+          <w:top w:val="single" w:color="auto" w:sz="4"/>
+          <w:left w:val="single" w:color="auto" w:sz="4"/>
+          <w:bottom w:val="single" w:color="auto" w:sz="4"/>
+          <w:right w:val="single" w:color="auto" w:sz="4"/>
+          <w:insideH w:val="single" w:color="auto" w:sz="4"/>
+          <w:insideV w:val="single" w:color="auto" w:sz="4"/>
+        </w:tblBorders>
+      </w:tblPr>
+      <w:tblGrid>
+        <w:gridCol w:w="2000"/>
+        <w:gridCol w:w="4000"/>
+        <w:gridCol w:w="2000"/>
+        <w:gridCol w:w="1600"/>
+      </w:tblGrid>
+      <w:tr>
+        <w:tc>
+          <w:tcPr>
+            <w:tcW w:type="dxa" w:w="2000"/>
+            <w:shd w:fill="D9E2F3" w:val="clear"/>
+          </w:tcPr>
+          <w:p>
+            <w:r>
+              <w:rPr>
+                <w:b/>
+                <w:bCs/>
+              </w:rPr>
+              <w:t xml:space="preserve">Rol</w:t>
+            </w:r>
+          </w:p>
+        </w:tc>
+        <w:tc>
+          <w:tcPr>
+            <w:tcW w:type="dxa" w:w="4000"/>
+            <w:shd w:fill="D9E2F3" w:val="clear"/>
+          </w:tcPr>
+          <w:p>
+            <w:r>
+              <w:rPr>
+                <w:b/>
+                <w:bCs/>
+              </w:rPr>
+              <w:t xml:space="preserve">Nombre</w:t>
+            </w:r>
+          </w:p>
+        </w:tc>
+        <w:tc>
+          <w:tcPr>
+            <w:tcW w:type="dxa" w:w="2000"/>
+            <w:shd w:fill="D9E2F3" w:val="clear"/>
+          </w:tcPr>
+          <w:p>
+            <w:r>
+              <w:rPr>
+                <w:b/>
+                <w:bCs/>
+              </w:rPr>
+              <w:t xml:space="preserve">Firma</w:t>
+            </w:r>
+          </w:p>
+        </w:tc>
+        <w:tc>
+          <w:tcPr>
+            <w:tcW w:type="dxa" w:w="1600"/>
+            <w:shd w:fill="D9E2F3" w:val="clear"/>
+          </w:tcPr>
+          <w:p>
+            <w:r>
+              <w:rPr>
+                <w:b/>
+                <w:bCs/>
+              </w:rPr>
+              <w:t xml:space="preserve">Fecha</w:t>
+            </w:r>
+          </w:p>
+        </w:tc>
+      </w:tr>
+      <w:tr>
+        <w:tc>
+          <w:tcPr>
+            <w:tcW w:type="dxa" w:w="2000"/>
+          </w:tcPr>
+          <w:p>
+            <w:r>
+              <w:rPr>
+                <w:b w:val="false"/>
+                <w:bCs w:val="false"/>
+              </w:rPr>
+              <w:t xml:space="preserve">Product Owner</w:t>
+            </w:r>
+          </w:p>
+        </w:tc>
+        <w:tc>
+          <w:tcPr>
+            <w:tcW w:type="dxa" w:w="4000"/>
+          </w:tcPr>
+          <w:p>
+            <w:r>
+              <w:rPr>
+                <w:b w:val="false"/>
+                <w:bCs w:val="false"/>
+              </w:rPr>
+              <w:t xml:space="preserve">Alonso David de León Rodarte</w:t>
+            </w:r>
+          </w:p>
+        </w:tc>
+        <w:tc>
+          <w:tcPr>
+            <w:tcW w:type="dxa" w:w="2000"/>
+          </w:tcPr>
+          <w:p>
+            <w:r>
+              <w:rPr>
+                <w:b w:val="false"/>
+                <w:bCs w:val="false"/>
+              </w:rPr>
+              <w:t xml:space="preserve"/>
+            </w:r>
+          </w:p>
+        </w:tc>
+        <w:tc>
+          <w:tcPr>
+            <w:tcW w:type="dxa" w:w="1600"/>
+          </w:tcPr>
+          <w:p>
+            <w:r>
+              <w:rPr>
+                <w:b w:val="false"/>
+                <w:bCs w:val="false"/>
+              </w:rPr>
+              <w:t xml:space="preserve"/>
+            </w:r>
+          </w:p>
+        </w:tc>
+      </w:tr>
+      <w:tr>
+        <w:tc>
+          <w:tcPr>
+            <w:tcW w:type="dxa" w:w="2000"/>
+          </w:tcPr>
+          <w:p>
+            <w:r>
+              <w:rPr>
+                <w:b w:val="false"/>
+                <w:bCs w:val="false"/>
+              </w:rPr>
+              <w:t xml:space="preserve">Scrum Master</w:t>
+            </w:r>
+          </w:p>
+        </w:tc>
+        <w:tc>
+          <w:tcPr>
+            <w:tcW w:type="dxa" w:w="4000"/>
+          </w:tcPr>
+          <w:p>
+            <w:r>
+              <w:rPr>
+                <w:b w:val="false"/>
+                <w:bCs w:val="false"/>
+              </w:rPr>
+              <w:t xml:space="preserve">Por asignar</w:t>
+            </w:r>
+          </w:p>
+        </w:tc>
+        <w:tc>
+          <w:tcPr>
+            <w:tcW w:type="dxa" w:w="2000"/>
+          </w:tcPr>
+          <w:p>
+            <w:r>
+              <w:rPr>
+                <w:b w:val="false"/>
+                <w:bCs w:val="false"/>
+              </w:rPr>
+              <w:t xml:space="preserve"/>
+            </w:r>
+          </w:p>
+        </w:tc>
+        <w:tc>
+          <w:tcPr>
+            <w:tcW w:type="dxa" w:w="1600"/>
+          </w:tcPr>
+          <w:p>
+            <w:r>
+              <w:rPr>
+                <w:b w:val="false"/>
+                <w:bCs w:val="false"/>
+              </w:rPr>
+              <w:t xml:space="preserve"/>
             </w:r>
           </w:p>
         </w:tc>

</xml_diff>